<commit_message>
Complete evidence boundaries and public deliverables
</commit_message>
<xml_diff>
--- a/artifacts/global-energy-atlas-methodology.docx
+++ b/artifacts/global-energy-atlas-methodology.docx
@@ -6,45 +6,9 @@
       <w:pPr>
         <w:pStyle w:val="Title"/>
         <w:jc w:val="left"/>
-        <w:pBdr>
-          <w:bottom w:val="nil"/>
-        </w:pBdr>
       </w:pPr>
       <w:r>
-        <w:rPr>
-          <w:rFonts w:ascii="Georgia" w:hAnsi="Georgia"/>
-          <w:color w:val="000000"/>
-          <w:sz w:val="44"/>
-        </w:rPr>
-        <w:t>Global Energy Decision Atlas Methodology Note</w:t>
-      </w:r>
-    </w:p>
-    <w:p>
-      <w:pPr>
-        <w:spacing w:after="120"/>
-      </w:pPr>
-      <w:r>
-        <w:rPr>
-          <w:rFonts w:ascii="Arial" w:hAnsi="Arial"/>
-          <w:b/>
-          <w:color w:val="176B54"/>
-          <w:sz w:val="17"/>
-        </w:rPr>
-        <w:t>Decision support for business energy and sustainability teams  |  Prepared 17 September 2026</w:t>
-      </w:r>
-    </w:p>
-    <w:p>
-      <w:pPr>
-        <w:spacing w:after="100"/>
-      </w:pPr>
-      <w:r>
-        <w:rPr>
-          <w:b/>
-        </w:rPr>
-        <w:t xml:space="preserve">Purpose  </w:t>
-      </w:r>
-      <w:r>
-        <w:t>The site compares national electricity price, generation mix, total energy consumption, and trade exposure across 15 countries. It supports early market screening. It does not replace a facility tariff study, procurement review, or supply reliability assessment.</w:t>
+        <w:t>Global Energy Decision Atlas Data and Methodology Note</w:t>
       </w:r>
     </w:p>
     <w:p>
@@ -52,12 +16,20 @@
         <w:pStyle w:val="Heading1"/>
       </w:pPr>
       <w:r>
-        <w:t>Data collection and provenance</w:t>
+        <w:t>Purpose</w:t>
       </w:r>
     </w:p>
     <w:p>
       <w:r>
-        <w:t>The assignment supplied a single CSV. The project stores that file unchanged and bundles it with the site, so the dashboard makes no runtime data or API requests. The CSV combines retail price pages from GlobalPetrolPrices, national consumption from Worldometer, electricity mix from Our World in Data and Ember, total energy balances from the International Energy Agency, and electricity trade from the US Energy Information Administration. Source URLs remain in the file. We accessed the supplied CSV on 17 September 2026.</w:t>
+        <w:t>The atlas screens national markets before local energy diligence. It keeps electricity price, generation structure, primary energy scale, and energy balance as separate measures so a reviewer can see the tradeoffs behind a shortlist.</w:t>
+      </w:r>
+    </w:p>
+    <w:p>
+      <w:pPr>
+        <w:pStyle w:val="Heading1"/>
+      </w:pPr>
+      <w:r>
+        <w:t>Two datasets</w:t>
       </w:r>
     </w:p>
     <w:tbl>
@@ -67,109 +39,113 @@
         <w:tblLook w:firstColumn="1" w:firstRow="1" w:lastColumn="0" w:lastRow="0" w:noHBand="0" w:noVBand="1" w:val="04A0"/>
       </w:tblPr>
       <w:tblGrid>
-        <w:gridCol w:w="2642"/>
-        <w:gridCol w:w="2642"/>
-        <w:gridCol w:w="2642"/>
-        <w:gridCol w:w="2642"/>
+        <w:gridCol w:w="3619"/>
+        <w:gridCol w:w="3619"/>
+        <w:gridCol w:w="3619"/>
       </w:tblGrid>
       <w:tr>
+        <w:trPr>
+          <w:tblHeader w:val="true"/>
+        </w:trPr>
         <w:tc>
           <w:tcPr>
-            <w:tcW w:type="dxa" w:w="2045"/>
-            <w:shd w:fill="176B54"/>
+            <w:tcW w:type="dxa" w:w="1699"/>
+            <w:vAlign w:val="center"/>
+            <w:shd w:fill="213B52"/>
             <w:tcBorders>
-              <w:top w:val="single" w:sz="4" w:color="D4CEC0"/>
-              <w:left w:val="single" w:sz="4" w:color="D4CEC0"/>
-              <w:bottom w:val="single" w:sz="4" w:color="D4CEC0"/>
-              <w:right w:val="single" w:sz="4" w:color="D4CEC0"/>
-              <w:insideH w:val="single" w:sz="4" w:color="D4CEC0"/>
-              <w:insideV w:val="single" w:sz="4" w:color="D4CEC0"/>
+              <w:top w:val="single" w:sz="4" w:color="D9D9D9"/>
+              <w:left w:val="single" w:sz="4" w:color="D9D9D9"/>
+              <w:bottom w:val="single" w:sz="4" w:color="D9D9D9"/>
+              <w:right w:val="single" w:sz="4" w:color="D9D9D9"/>
             </w:tcBorders>
-            <w:vAlign w:val="center"/>
+            <w:tcMar>
+              <w:top w:w="32" w:type="dxa"/>
+              <w:start w:w="55" w:type="dxa"/>
+              <w:bottom w:w="32" w:type="dxa"/>
+              <w:end w:w="55" w:type="dxa"/>
+            </w:tcMar>
           </w:tcPr>
           <w:p>
+            <w:pPr>
+              <w:spacing w:before="0" w:after="0" w:line="240" w:lineRule="auto"/>
+              <w:jc w:val="left"/>
+            </w:pPr>
             <w:r>
               <w:rPr>
+                <w:rFonts w:ascii="Arial" w:hAnsi="Arial"/>
                 <w:b/>
                 <w:color w:val="FFFFFF"/>
-                <w:sz w:val="15"/>
+                <w:sz w:val="19"/>
               </w:rPr>
-              <w:t>Measure</w:t>
+              <w:t>Dataset</w:t>
             </w:r>
           </w:p>
         </w:tc>
         <w:tc>
           <w:tcPr>
-            <w:tcW w:type="dxa" w:w="1843"/>
-            <w:shd w:fill="176B54"/>
+            <w:tcW w:type="dxa" w:w="5400"/>
+            <w:vAlign w:val="center"/>
+            <w:shd w:fill="213B52"/>
             <w:tcBorders>
-              <w:top w:val="single" w:sz="4" w:color="D4CEC0"/>
-              <w:left w:val="single" w:sz="4" w:color="D4CEC0"/>
-              <w:bottom w:val="single" w:sz="4" w:color="D4CEC0"/>
-              <w:right w:val="single" w:sz="4" w:color="D4CEC0"/>
-              <w:insideH w:val="single" w:sz="4" w:color="D4CEC0"/>
-              <w:insideV w:val="single" w:sz="4" w:color="D4CEC0"/>
+              <w:top w:val="single" w:sz="4" w:color="D9D9D9"/>
+              <w:left w:val="single" w:sz="4" w:color="D9D9D9"/>
+              <w:bottom w:val="single" w:sz="4" w:color="D9D9D9"/>
+              <w:right w:val="single" w:sz="4" w:color="D9D9D9"/>
             </w:tcBorders>
-            <w:vAlign w:val="center"/>
+            <w:tcMar>
+              <w:top w:w="32" w:type="dxa"/>
+              <w:start w:w="55" w:type="dxa"/>
+              <w:bottom w:w="32" w:type="dxa"/>
+              <w:end w:w="55" w:type="dxa"/>
+            </w:tcMar>
           </w:tcPr>
           <w:p>
+            <w:pPr>
+              <w:spacing w:before="0" w:after="0" w:line="240" w:lineRule="auto"/>
+              <w:jc w:val="left"/>
+            </w:pPr>
             <w:r>
               <w:rPr>
+                <w:rFonts w:ascii="Arial" w:hAnsi="Arial"/>
                 <w:b/>
                 <w:color w:val="FFFFFF"/>
-                <w:sz w:val="15"/>
+                <w:sz w:val="19"/>
               </w:rPr>
-              <w:t>Reference date</w:t>
+              <w:t>Coverage and periods</w:t>
             </w:r>
           </w:p>
         </w:tc>
         <w:tc>
           <w:tcPr>
-            <w:tcW w:type="dxa" w:w="1699"/>
-            <w:shd w:fill="176B54"/>
+            <w:tcW w:type="dxa" w:w="3413"/>
+            <w:vAlign w:val="center"/>
+            <w:shd w:fill="213B52"/>
             <w:tcBorders>
-              <w:top w:val="single" w:sz="4" w:color="D4CEC0"/>
-              <w:left w:val="single" w:sz="4" w:color="D4CEC0"/>
-              <w:bottom w:val="single" w:sz="4" w:color="D4CEC0"/>
-              <w:right w:val="single" w:sz="4" w:color="D4CEC0"/>
-              <w:insideH w:val="single" w:sz="4" w:color="D4CEC0"/>
-              <w:insideV w:val="single" w:sz="4" w:color="D4CEC0"/>
+              <w:top w:val="single" w:sz="4" w:color="D9D9D9"/>
+              <w:left w:val="single" w:sz="4" w:color="D9D9D9"/>
+              <w:bottom w:val="single" w:sz="4" w:color="D9D9D9"/>
+              <w:right w:val="single" w:sz="4" w:color="D9D9D9"/>
             </w:tcBorders>
-            <w:vAlign w:val="center"/>
+            <w:tcMar>
+              <w:top w:w="32" w:type="dxa"/>
+              <w:start w:w="55" w:type="dxa"/>
+              <w:bottom w:w="32" w:type="dxa"/>
+              <w:end w:w="55" w:type="dxa"/>
+            </w:tcMar>
           </w:tcPr>
           <w:p>
+            <w:pPr>
+              <w:spacing w:before="0" w:after="0" w:line="240" w:lineRule="auto"/>
+              <w:jc w:val="left"/>
+            </w:pPr>
             <w:r>
               <w:rPr>
+                <w:rFonts w:ascii="Arial" w:hAnsi="Arial"/>
                 <w:b/>
                 <w:color w:val="FFFFFF"/>
-                <w:sz w:val="15"/>
+                <w:sz w:val="19"/>
               </w:rPr>
-              <w:t>Unit</w:t>
-            </w:r>
-          </w:p>
-        </w:tc>
-        <w:tc>
-          <w:tcPr>
-            <w:tcW w:type="dxa" w:w="4824"/>
-            <w:shd w:fill="176B54"/>
-            <w:tcBorders>
-              <w:top w:val="single" w:sz="4" w:color="D4CEC0"/>
-              <w:left w:val="single" w:sz="4" w:color="D4CEC0"/>
-              <w:bottom w:val="single" w:sz="4" w:color="D4CEC0"/>
-              <w:right w:val="single" w:sz="4" w:color="D4CEC0"/>
-              <w:insideH w:val="single" w:sz="4" w:color="D4CEC0"/>
-              <w:insideV w:val="single" w:sz="4" w:color="D4CEC0"/>
-            </w:tcBorders>
-            <w:vAlign w:val="center"/>
-          </w:tcPr>
-          <w:p>
-            <w:r>
-              <w:rPr>
-                <w:b/>
-                <w:color w:val="FFFFFF"/>
-                <w:sz w:val="15"/>
-              </w:rPr>
-              <w:t>Interpretation</w:t>
+              <w:t>Balance measure</w:t>
             </w:r>
           </w:p>
         </w:tc>
@@ -177,105 +153,103 @@
       <w:tr>
         <w:tc>
           <w:tcPr>
-            <w:tcW w:type="dxa" w:w="2045"/>
-            <w:shd w:fill="E8EEE8"/>
+            <w:tcW w:type="dxa" w:w="1699"/>
+            <w:vAlign w:val="center"/>
+            <w:shd w:fill="FFFFFF"/>
             <w:tcBorders>
-              <w:top w:val="single" w:sz="4" w:color="D4CEC0"/>
-              <w:left w:val="single" w:sz="4" w:color="D4CEC0"/>
-              <w:bottom w:val="single" w:sz="4" w:color="D4CEC0"/>
-              <w:right w:val="single" w:sz="4" w:color="D4CEC0"/>
-              <w:insideH w:val="single" w:sz="4" w:color="D4CEC0"/>
-              <w:insideV w:val="single" w:sz="4" w:color="D4CEC0"/>
+              <w:top w:val="single" w:sz="4" w:color="D9D9D9"/>
+              <w:left w:val="single" w:sz="4" w:color="D9D9D9"/>
+              <w:bottom w:val="single" w:sz="4" w:color="D9D9D9"/>
+              <w:right w:val="single" w:sz="4" w:color="D9D9D9"/>
             </w:tcBorders>
-            <w:vAlign w:val="center"/>
+            <w:tcMar>
+              <w:top w:w="32" w:type="dxa"/>
+              <w:start w:w="55" w:type="dxa"/>
+              <w:bottom w:w="32" w:type="dxa"/>
+              <w:end w:w="55" w:type="dxa"/>
+            </w:tcMar>
           </w:tcPr>
           <w:p>
             <w:pPr>
-              <w:spacing w:after="0"/>
+              <w:spacing w:before="0" w:after="0" w:line="240" w:lineRule="auto"/>
+              <w:jc w:val="left"/>
             </w:pPr>
             <w:r>
               <w:rPr>
-                <w:sz w:val="14"/>
+                <w:rFonts w:ascii="Arial" w:hAnsi="Arial"/>
+                <w:b w:val="0"/>
+                <w:color w:val="000000"/>
+                <w:sz w:val="19"/>
               </w:rPr>
-              <w:t>Retail electricity price</w:t>
+              <w:t>Assignment 15</w:t>
             </w:r>
           </w:p>
         </w:tc>
         <w:tc>
           <w:tcPr>
-            <w:tcW w:type="dxa" w:w="1843"/>
-            <w:shd w:fill="E8EEE8"/>
+            <w:tcW w:type="dxa" w:w="5400"/>
+            <w:vAlign w:val="center"/>
+            <w:shd w:fill="FFFFFF"/>
             <w:tcBorders>
-              <w:top w:val="single" w:sz="4" w:color="D4CEC0"/>
-              <w:left w:val="single" w:sz="4" w:color="D4CEC0"/>
-              <w:bottom w:val="single" w:sz="4" w:color="D4CEC0"/>
-              <w:right w:val="single" w:sz="4" w:color="D4CEC0"/>
-              <w:insideH w:val="single" w:sz="4" w:color="D4CEC0"/>
-              <w:insideV w:val="single" w:sz="4" w:color="D4CEC0"/>
+              <w:top w:val="single" w:sz="4" w:color="D9D9D9"/>
+              <w:left w:val="single" w:sz="4" w:color="D9D9D9"/>
+              <w:bottom w:val="single" w:sz="4" w:color="D9D9D9"/>
+              <w:right w:val="single" w:sz="4" w:color="D9D9D9"/>
             </w:tcBorders>
-            <w:vAlign w:val="center"/>
+            <w:tcMar>
+              <w:top w:w="32" w:type="dxa"/>
+              <w:start w:w="55" w:type="dxa"/>
+              <w:bottom w:w="32" w:type="dxa"/>
+              <w:end w:w="55" w:type="dxa"/>
+            </w:tcMar>
           </w:tcPr>
           <w:p>
             <w:pPr>
-              <w:spacing w:after="0"/>
+              <w:spacing w:before="0" w:after="0" w:line="240" w:lineRule="auto"/>
+              <w:jc w:val="left"/>
             </w:pPr>
             <w:r>
               <w:rPr>
-                <w:sz w:val="14"/>
+                <w:rFonts w:ascii="Arial" w:hAnsi="Arial"/>
+                <w:b w:val="0"/>
+                <w:color w:val="000000"/>
+                <w:sz w:val="19"/>
               </w:rPr>
-              <w:t>December 2025</w:t>
+              <w:t>15 countries. December 2025 price, 2024 consumption and mix, 2023 trade.</w:t>
             </w:r>
           </w:p>
         </w:tc>
         <w:tc>
           <w:tcPr>
-            <w:tcW w:type="dxa" w:w="1699"/>
-            <w:shd w:fill="E8EEE8"/>
+            <w:tcW w:type="dxa" w:w="3413"/>
+            <w:vAlign w:val="center"/>
+            <w:shd w:fill="FFFFFF"/>
             <w:tcBorders>
-              <w:top w:val="single" w:sz="4" w:color="D4CEC0"/>
-              <w:left w:val="single" w:sz="4" w:color="D4CEC0"/>
-              <w:bottom w:val="single" w:sz="4" w:color="D4CEC0"/>
-              <w:right w:val="single" w:sz="4" w:color="D4CEC0"/>
-              <w:insideH w:val="single" w:sz="4" w:color="D4CEC0"/>
-              <w:insideV w:val="single" w:sz="4" w:color="D4CEC0"/>
+              <w:top w:val="single" w:sz="4" w:color="D9D9D9"/>
+              <w:left w:val="single" w:sz="4" w:color="D9D9D9"/>
+              <w:bottom w:val="single" w:sz="4" w:color="D9D9D9"/>
+              <w:right w:val="single" w:sz="4" w:color="D9D9D9"/>
             </w:tcBorders>
-            <w:vAlign w:val="center"/>
+            <w:tcMar>
+              <w:top w:w="32" w:type="dxa"/>
+              <w:start w:w="55" w:type="dxa"/>
+              <w:bottom w:w="32" w:type="dxa"/>
+              <w:end w:w="55" w:type="dxa"/>
+            </w:tcMar>
           </w:tcPr>
           <w:p>
             <w:pPr>
-              <w:spacing w:after="0"/>
+              <w:spacing w:before="0" w:after="0" w:line="240" w:lineRule="auto"/>
+              <w:jc w:val="left"/>
             </w:pPr>
             <w:r>
               <w:rPr>
-                <w:sz w:val="14"/>
+                <w:rFonts w:ascii="Arial" w:hAnsi="Arial"/>
+                <w:b w:val="0"/>
+                <w:color w:val="000000"/>
+                <w:sz w:val="19"/>
               </w:rPr>
-              <w:t>USD/kWh and local currency/kWh</w:t>
-            </w:r>
-          </w:p>
-        </w:tc>
-        <w:tc>
-          <w:tcPr>
-            <w:tcW w:type="dxa" w:w="4824"/>
-            <w:shd w:fill="E8EEE8"/>
-            <w:tcBorders>
-              <w:top w:val="single" w:sz="4" w:color="D4CEC0"/>
-              <w:left w:val="single" w:sz="4" w:color="D4CEC0"/>
-              <w:bottom w:val="single" w:sz="4" w:color="D4CEC0"/>
-              <w:right w:val="single" w:sz="4" w:color="D4CEC0"/>
-              <w:insideH w:val="single" w:sz="4" w:color="D4CEC0"/>
-              <w:insideV w:val="single" w:sz="4" w:color="D4CEC0"/>
-            </w:tcBorders>
-            <w:vAlign w:val="center"/>
-          </w:tcPr>
-          <w:p>
-            <w:pPr>
-              <w:spacing w:after="0"/>
-            </w:pPr>
-            <w:r>
-              <w:rPr>
-                <w:sz w:val="14"/>
-              </w:rPr>
-              <w:t>Household annual average use; business use of 1,000,000 kWh/year</w:t>
+              <w:t>Reported total energy net imports.</w:t>
             </w:r>
           </w:p>
         </w:tc>
@@ -283,105 +257,235 @@
       <w:tr>
         <w:tc>
           <w:tcPr>
-            <w:tcW w:type="dxa" w:w="2045"/>
-            <w:shd w:fill="FFFFFF"/>
+            <w:tcW w:type="dxa" w:w="1699"/>
+            <w:vAlign w:val="center"/>
+            <w:shd w:fill="EFF5F2"/>
             <w:tcBorders>
-              <w:top w:val="single" w:sz="4" w:color="D4CEC0"/>
-              <w:left w:val="single" w:sz="4" w:color="D4CEC0"/>
-              <w:bottom w:val="single" w:sz="4" w:color="D4CEC0"/>
-              <w:right w:val="single" w:sz="4" w:color="D4CEC0"/>
-              <w:insideH w:val="single" w:sz="4" w:color="D4CEC0"/>
-              <w:insideV w:val="single" w:sz="4" w:color="D4CEC0"/>
+              <w:top w:val="single" w:sz="4" w:color="D9D9D9"/>
+              <w:left w:val="single" w:sz="4" w:color="D9D9D9"/>
+              <w:bottom w:val="single" w:sz="4" w:color="D9D9D9"/>
+              <w:right w:val="single" w:sz="4" w:color="D9D9D9"/>
             </w:tcBorders>
-            <w:vAlign w:val="center"/>
+            <w:tcMar>
+              <w:top w:w="32" w:type="dxa"/>
+              <w:start w:w="55" w:type="dxa"/>
+              <w:bottom w:w="32" w:type="dxa"/>
+              <w:end w:w="55" w:type="dxa"/>
+            </w:tcMar>
           </w:tcPr>
           <w:p>
             <w:pPr>
-              <w:spacing w:after="0"/>
+              <w:spacing w:before="0" w:after="0" w:line="240" w:lineRule="auto"/>
+              <w:jc w:val="left"/>
             </w:pPr>
             <w:r>
               <w:rPr>
-                <w:sz w:val="14"/>
+                <w:rFonts w:ascii="Arial" w:hAnsi="Arial"/>
+                <w:b w:val="0"/>
+                <w:color w:val="000000"/>
+                <w:sz w:val="19"/>
               </w:rPr>
-              <w:t>Total energy consumption</w:t>
+              <w:t>Expanded 50</w:t>
             </w:r>
           </w:p>
         </w:tc>
         <w:tc>
           <w:tcPr>
-            <w:tcW w:type="dxa" w:w="1843"/>
-            <w:shd w:fill="FFFFFF"/>
+            <w:tcW w:type="dxa" w:w="5400"/>
+            <w:vAlign w:val="center"/>
+            <w:shd w:fill="EFF5F2"/>
             <w:tcBorders>
-              <w:top w:val="single" w:sz="4" w:color="D4CEC0"/>
-              <w:left w:val="single" w:sz="4" w:color="D4CEC0"/>
-              <w:bottom w:val="single" w:sz="4" w:color="D4CEC0"/>
-              <w:right w:val="single" w:sz="4" w:color="D4CEC0"/>
-              <w:insideH w:val="single" w:sz="4" w:color="D4CEC0"/>
-              <w:insideV w:val="single" w:sz="4" w:color="D4CEC0"/>
+              <w:top w:val="single" w:sz="4" w:color="D9D9D9"/>
+              <w:left w:val="single" w:sz="4" w:color="D9D9D9"/>
+              <w:bottom w:val="single" w:sz="4" w:color="D9D9D9"/>
+              <w:right w:val="single" w:sz="4" w:color="D9D9D9"/>
             </w:tcBorders>
-            <w:vAlign w:val="center"/>
+            <w:tcMar>
+              <w:top w:w="32" w:type="dxa"/>
+              <w:start w:w="55" w:type="dxa"/>
+              <w:bottom w:w="32" w:type="dxa"/>
+              <w:end w:w="55" w:type="dxa"/>
+            </w:tcMar>
           </w:tcPr>
           <w:p>
             <w:pPr>
-              <w:spacing w:after="0"/>
+              <w:spacing w:before="0" w:after="0" w:line="240" w:lineRule="auto"/>
+              <w:jc w:val="left"/>
             </w:pPr>
             <w:r>
               <w:rPr>
-                <w:sz w:val="14"/>
+                <w:rFonts w:ascii="Arial" w:hAnsi="Arial"/>
+                <w:b w:val="0"/>
+                <w:color w:val="000000"/>
+                <w:sz w:val="19"/>
               </w:rPr>
-              <w:t>2024</w:t>
+              <w:t>50 countries. 2023-2026 average price and 2023 energy measures.</w:t>
             </w:r>
           </w:p>
         </w:tc>
         <w:tc>
           <w:tcPr>
-            <w:tcW w:type="dxa" w:w="1699"/>
-            <w:shd w:fill="FFFFFF"/>
+            <w:tcW w:type="dxa" w:w="3413"/>
+            <w:vAlign w:val="center"/>
+            <w:shd w:fill="EFF5F2"/>
             <w:tcBorders>
-              <w:top w:val="single" w:sz="4" w:color="D4CEC0"/>
-              <w:left w:val="single" w:sz="4" w:color="D4CEC0"/>
-              <w:bottom w:val="single" w:sz="4" w:color="D4CEC0"/>
-              <w:right w:val="single" w:sz="4" w:color="D4CEC0"/>
-              <w:insideH w:val="single" w:sz="4" w:color="D4CEC0"/>
-              <w:insideV w:val="single" w:sz="4" w:color="D4CEC0"/>
+              <w:top w:val="single" w:sz="4" w:color="D9D9D9"/>
+              <w:left w:val="single" w:sz="4" w:color="D9D9D9"/>
+              <w:bottom w:val="single" w:sz="4" w:color="D9D9D9"/>
+              <w:right w:val="single" w:sz="4" w:color="D9D9D9"/>
             </w:tcBorders>
-            <w:vAlign w:val="center"/>
+            <w:tcMar>
+              <w:top w:w="32" w:type="dxa"/>
+              <w:start w:w="55" w:type="dxa"/>
+              <w:bottom w:w="32" w:type="dxa"/>
+              <w:end w:w="55" w:type="dxa"/>
+            </w:tcMar>
           </w:tcPr>
           <w:p>
             <w:pPr>
-              <w:spacing w:after="0"/>
+              <w:spacing w:before="0" w:after="0" w:line="240" w:lineRule="auto"/>
+              <w:jc w:val="left"/>
             </w:pPr>
             <w:r>
               <w:rPr>
-                <w:sz w:val="14"/>
+                <w:rFonts w:ascii="Arial" w:hAnsi="Arial"/>
+                <w:b w:val="0"/>
+                <w:color w:val="000000"/>
+                <w:sz w:val="19"/>
               </w:rPr>
-              <w:t>Exajoules</w:t>
+              <w:t>Primary energy consumption minus total energy production, used as a screening proxy.</w:t>
+            </w:r>
+          </w:p>
+        </w:tc>
+      </w:tr>
+    </w:tbl>
+    <w:p>
+      <w:pPr>
+        <w:spacing w:after="0" w:line="60" w:lineRule="auto"/>
+      </w:pPr>
+    </w:p>
+    <w:p>
+      <w:pPr>
+        <w:pStyle w:val="Heading1"/>
+      </w:pPr>
+      <w:r>
+        <w:t>Indicators and sources</w:t>
+      </w:r>
+    </w:p>
+    <w:tbl>
+      <w:tblPr>
+        <w:tblW w:type="auto" w:w="0"/>
+        <w:tblLayout w:type="fixed"/>
+        <w:tblLook w:firstColumn="1" w:firstRow="1" w:lastColumn="0" w:lastRow="0" w:noHBand="0" w:noVBand="1" w:val="04A0"/>
+      </w:tblPr>
+      <w:tblGrid>
+        <w:gridCol w:w="3619"/>
+        <w:gridCol w:w="3619"/>
+        <w:gridCol w:w="3619"/>
+      </w:tblGrid>
+      <w:tr>
+        <w:trPr>
+          <w:tblHeader w:val="true"/>
+        </w:trPr>
+        <w:tc>
+          <w:tcPr>
+            <w:tcW w:type="dxa" w:w="1987"/>
+            <w:vAlign w:val="center"/>
+            <w:shd w:fill="213B52"/>
+            <w:tcBorders>
+              <w:top w:val="single" w:sz="4" w:color="D9D9D9"/>
+              <w:left w:val="single" w:sz="4" w:color="D9D9D9"/>
+              <w:bottom w:val="single" w:sz="4" w:color="D9D9D9"/>
+              <w:right w:val="single" w:sz="4" w:color="D9D9D9"/>
+            </w:tcBorders>
+            <w:tcMar>
+              <w:top w:w="32" w:type="dxa"/>
+              <w:start w:w="55" w:type="dxa"/>
+              <w:bottom w:w="32" w:type="dxa"/>
+              <w:end w:w="55" w:type="dxa"/>
+            </w:tcMar>
+          </w:tcPr>
+          <w:p>
+            <w:pPr>
+              <w:spacing w:before="0" w:after="0" w:line="240" w:lineRule="auto"/>
+              <w:jc w:val="left"/>
+            </w:pPr>
+            <w:r>
+              <w:rPr>
+                <w:rFonts w:ascii="Arial" w:hAnsi="Arial"/>
+                <w:b/>
+                <w:color w:val="FFFFFF"/>
+                <w:sz w:val="19"/>
+              </w:rPr>
+              <w:t>Indicator</w:t>
             </w:r>
           </w:p>
         </w:tc>
         <w:tc>
           <w:tcPr>
-            <w:tcW w:type="dxa" w:w="4824"/>
-            <w:shd w:fill="FFFFFF"/>
+            <w:tcW w:type="dxa" w:w="5472"/>
+            <w:vAlign w:val="center"/>
+            <w:shd w:fill="213B52"/>
             <w:tcBorders>
-              <w:top w:val="single" w:sz="4" w:color="D4CEC0"/>
-              <w:left w:val="single" w:sz="4" w:color="D4CEC0"/>
-              <w:bottom w:val="single" w:sz="4" w:color="D4CEC0"/>
-              <w:right w:val="single" w:sz="4" w:color="D4CEC0"/>
-              <w:insideH w:val="single" w:sz="4" w:color="D4CEC0"/>
-              <w:insideV w:val="single" w:sz="4" w:color="D4CEC0"/>
+              <w:top w:val="single" w:sz="4" w:color="D9D9D9"/>
+              <w:left w:val="single" w:sz="4" w:color="D9D9D9"/>
+              <w:bottom w:val="single" w:sz="4" w:color="D9D9D9"/>
+              <w:right w:val="single" w:sz="4" w:color="D9D9D9"/>
             </w:tcBorders>
-            <w:vAlign w:val="center"/>
+            <w:tcMar>
+              <w:top w:w="32" w:type="dxa"/>
+              <w:start w:w="55" w:type="dxa"/>
+              <w:bottom w:w="32" w:type="dxa"/>
+              <w:end w:w="55" w:type="dxa"/>
+            </w:tcMar>
           </w:tcPr>
           <w:p>
             <w:pPr>
-              <w:spacing w:after="0"/>
+              <w:spacing w:before="0" w:after="0" w:line="240" w:lineRule="auto"/>
+              <w:jc w:val="left"/>
             </w:pPr>
             <w:r>
               <w:rPr>
-                <w:sz w:val="14"/>
+                <w:rFonts w:ascii="Arial" w:hAnsi="Arial"/>
+                <w:b/>
+                <w:color w:val="FFFFFF"/>
+                <w:sz w:val="19"/>
               </w:rPr>
-              <w:t>Absolute national total, not per capita or electricity-only use</w:t>
+              <w:t>Definition and unit</w:t>
+            </w:r>
+          </w:p>
+        </w:tc>
+        <w:tc>
+          <w:tcPr>
+            <w:tcW w:type="dxa" w:w="3053"/>
+            <w:vAlign w:val="center"/>
+            <w:shd w:fill="213B52"/>
+            <w:tcBorders>
+              <w:top w:val="single" w:sz="4" w:color="D9D9D9"/>
+              <w:left w:val="single" w:sz="4" w:color="D9D9D9"/>
+              <w:bottom w:val="single" w:sz="4" w:color="D9D9D9"/>
+              <w:right w:val="single" w:sz="4" w:color="D9D9D9"/>
+            </w:tcBorders>
+            <w:tcMar>
+              <w:top w:w="32" w:type="dxa"/>
+              <w:start w:w="55" w:type="dxa"/>
+              <w:bottom w:w="32" w:type="dxa"/>
+              <w:end w:w="55" w:type="dxa"/>
+            </w:tcMar>
+          </w:tcPr>
+          <w:p>
+            <w:pPr>
+              <w:spacing w:before="0" w:after="0" w:line="240" w:lineRule="auto"/>
+              <w:jc w:val="left"/>
+            </w:pPr>
+            <w:r>
+              <w:rPr>
+                <w:rFonts w:ascii="Arial" w:hAnsi="Arial"/>
+                <w:b/>
+                <w:color w:val="FFFFFF"/>
+                <w:sz w:val="19"/>
+              </w:rPr>
+              <w:t>Primary source</w:t>
             </w:r>
           </w:p>
         </w:tc>
@@ -389,105 +493,103 @@
       <w:tr>
         <w:tc>
           <w:tcPr>
-            <w:tcW w:type="dxa" w:w="2045"/>
-            <w:shd w:fill="E8EEE8"/>
+            <w:tcW w:type="dxa" w:w="1987"/>
+            <w:vAlign w:val="center"/>
+            <w:shd w:fill="FFFFFF"/>
             <w:tcBorders>
-              <w:top w:val="single" w:sz="4" w:color="D4CEC0"/>
-              <w:left w:val="single" w:sz="4" w:color="D4CEC0"/>
-              <w:bottom w:val="single" w:sz="4" w:color="D4CEC0"/>
-              <w:right w:val="single" w:sz="4" w:color="D4CEC0"/>
-              <w:insideH w:val="single" w:sz="4" w:color="D4CEC0"/>
-              <w:insideV w:val="single" w:sz="4" w:color="D4CEC0"/>
+              <w:top w:val="single" w:sz="4" w:color="D9D9D9"/>
+              <w:left w:val="single" w:sz="4" w:color="D9D9D9"/>
+              <w:bottom w:val="single" w:sz="4" w:color="D9D9D9"/>
+              <w:right w:val="single" w:sz="4" w:color="D9D9D9"/>
             </w:tcBorders>
-            <w:vAlign w:val="center"/>
+            <w:tcMar>
+              <w:top w:w="32" w:type="dxa"/>
+              <w:start w:w="55" w:type="dxa"/>
+              <w:bottom w:w="32" w:type="dxa"/>
+              <w:end w:w="55" w:type="dxa"/>
+            </w:tcMar>
           </w:tcPr>
           <w:p>
             <w:pPr>
-              <w:spacing w:after="0"/>
+              <w:spacing w:before="0" w:after="0" w:line="240" w:lineRule="auto"/>
+              <w:jc w:val="left"/>
             </w:pPr>
             <w:r>
               <w:rPr>
-                <w:sz w:val="14"/>
+                <w:rFonts w:ascii="Arial" w:hAnsi="Arial"/>
+                <w:b w:val="0"/>
+                <w:color w:val="000000"/>
+                <w:sz w:val="19"/>
               </w:rPr>
-              <w:t>Electricity generation mix</w:t>
+              <w:t>Electricity price</w:t>
             </w:r>
           </w:p>
         </w:tc>
         <w:tc>
           <w:tcPr>
-            <w:tcW w:type="dxa" w:w="1843"/>
-            <w:shd w:fill="E8EEE8"/>
+            <w:tcW w:type="dxa" w:w="5472"/>
+            <w:vAlign w:val="center"/>
+            <w:shd w:fill="FFFFFF"/>
             <w:tcBorders>
-              <w:top w:val="single" w:sz="4" w:color="D4CEC0"/>
-              <w:left w:val="single" w:sz="4" w:color="D4CEC0"/>
-              <w:bottom w:val="single" w:sz="4" w:color="D4CEC0"/>
-              <w:right w:val="single" w:sz="4" w:color="D4CEC0"/>
-              <w:insideH w:val="single" w:sz="4" w:color="D4CEC0"/>
-              <w:insideV w:val="single" w:sz="4" w:color="D4CEC0"/>
+              <w:top w:val="single" w:sz="4" w:color="D9D9D9"/>
+              <w:left w:val="single" w:sz="4" w:color="D9D9D9"/>
+              <w:bottom w:val="single" w:sz="4" w:color="D9D9D9"/>
+              <w:right w:val="single" w:sz="4" w:color="D9D9D9"/>
             </w:tcBorders>
-            <w:vAlign w:val="center"/>
+            <w:tcMar>
+              <w:top w:w="32" w:type="dxa"/>
+              <w:start w:w="55" w:type="dxa"/>
+              <w:bottom w:w="32" w:type="dxa"/>
+              <w:end w:w="55" w:type="dxa"/>
+            </w:tcMar>
           </w:tcPr>
           <w:p>
             <w:pPr>
-              <w:spacing w:after="0"/>
+              <w:spacing w:before="0" w:after="0" w:line="240" w:lineRule="auto"/>
+              <w:jc w:val="left"/>
             </w:pPr>
             <w:r>
               <w:rPr>
-                <w:sz w:val="14"/>
+                <w:rFonts w:ascii="Arial" w:hAnsi="Arial"/>
+                <w:b w:val="0"/>
+                <w:color w:val="000000"/>
+                <w:sz w:val="19"/>
               </w:rPr>
-              <w:t>2024</w:t>
+              <w:t>Residential average use or commercial 1,000,000 kWh per year, USD/kWh.</w:t>
             </w:r>
           </w:p>
         </w:tc>
         <w:tc>
           <w:tcPr>
-            <w:tcW w:type="dxa" w:w="1699"/>
-            <w:shd w:fill="E8EEE8"/>
+            <w:tcW w:type="dxa" w:w="3053"/>
+            <w:vAlign w:val="center"/>
+            <w:shd w:fill="FFFFFF"/>
             <w:tcBorders>
-              <w:top w:val="single" w:sz="4" w:color="D4CEC0"/>
-              <w:left w:val="single" w:sz="4" w:color="D4CEC0"/>
-              <w:bottom w:val="single" w:sz="4" w:color="D4CEC0"/>
-              <w:right w:val="single" w:sz="4" w:color="D4CEC0"/>
-              <w:insideH w:val="single" w:sz="4" w:color="D4CEC0"/>
-              <w:insideV w:val="single" w:sz="4" w:color="D4CEC0"/>
+              <w:top w:val="single" w:sz="4" w:color="D9D9D9"/>
+              <w:left w:val="single" w:sz="4" w:color="D9D9D9"/>
+              <w:bottom w:val="single" w:sz="4" w:color="D9D9D9"/>
+              <w:right w:val="single" w:sz="4" w:color="D9D9D9"/>
             </w:tcBorders>
-            <w:vAlign w:val="center"/>
+            <w:tcMar>
+              <w:top w:w="32" w:type="dxa"/>
+              <w:start w:w="55" w:type="dxa"/>
+              <w:bottom w:w="32" w:type="dxa"/>
+              <w:end w:w="55" w:type="dxa"/>
+            </w:tcMar>
           </w:tcPr>
           <w:p>
             <w:pPr>
-              <w:spacing w:after="0"/>
+              <w:spacing w:before="0" w:after="0" w:line="240" w:lineRule="auto"/>
+              <w:jc w:val="left"/>
             </w:pPr>
             <w:r>
               <w:rPr>
-                <w:sz w:val="14"/>
+                <w:rFonts w:ascii="Arial" w:hAnsi="Arial"/>
+                <w:b w:val="0"/>
+                <w:color w:val="000000"/>
+                <w:sz w:val="19"/>
               </w:rPr>
-              <w:t>Percent of domestic generation</w:t>
-            </w:r>
-          </w:p>
-        </w:tc>
-        <w:tc>
-          <w:tcPr>
-            <w:tcW w:type="dxa" w:w="4824"/>
-            <w:shd w:fill="E8EEE8"/>
-            <w:tcBorders>
-              <w:top w:val="single" w:sz="4" w:color="D4CEC0"/>
-              <w:left w:val="single" w:sz="4" w:color="D4CEC0"/>
-              <w:bottom w:val="single" w:sz="4" w:color="D4CEC0"/>
-              <w:right w:val="single" w:sz="4" w:color="D4CEC0"/>
-              <w:insideH w:val="single" w:sz="4" w:color="D4CEC0"/>
-              <w:insideV w:val="single" w:sz="4" w:color="D4CEC0"/>
-            </w:tcBorders>
-            <w:vAlign w:val="center"/>
-          </w:tcPr>
-          <w:p>
-            <w:pPr>
-              <w:spacing w:after="0"/>
-            </w:pPr>
-            <w:r>
-              <w:rPr>
-                <w:sz w:val="14"/>
-              </w:rPr>
-              <w:t>Generation rather than capacity or electricity consumed</w:t>
+              <w:t>GlobalPetrolPrices public comparison.</w:t>
             </w:r>
           </w:p>
         </w:tc>
@@ -495,105 +597,311 @@
       <w:tr>
         <w:tc>
           <w:tcPr>
-            <w:tcW w:type="dxa" w:w="2045"/>
-            <w:shd w:fill="FFFFFF"/>
+            <w:tcW w:type="dxa" w:w="1987"/>
+            <w:vAlign w:val="center"/>
+            <w:shd w:fill="EFF5F2"/>
             <w:tcBorders>
-              <w:top w:val="single" w:sz="4" w:color="D4CEC0"/>
-              <w:left w:val="single" w:sz="4" w:color="D4CEC0"/>
-              <w:bottom w:val="single" w:sz="4" w:color="D4CEC0"/>
-              <w:right w:val="single" w:sz="4" w:color="D4CEC0"/>
-              <w:insideH w:val="single" w:sz="4" w:color="D4CEC0"/>
-              <w:insideV w:val="single" w:sz="4" w:color="D4CEC0"/>
+              <w:top w:val="single" w:sz="4" w:color="D9D9D9"/>
+              <w:left w:val="single" w:sz="4" w:color="D9D9D9"/>
+              <w:bottom w:val="single" w:sz="4" w:color="D9D9D9"/>
+              <w:right w:val="single" w:sz="4" w:color="D9D9D9"/>
             </w:tcBorders>
-            <w:vAlign w:val="center"/>
+            <w:tcMar>
+              <w:top w:w="32" w:type="dxa"/>
+              <w:start w:w="55" w:type="dxa"/>
+              <w:bottom w:w="32" w:type="dxa"/>
+              <w:end w:w="55" w:type="dxa"/>
+            </w:tcMar>
           </w:tcPr>
           <w:p>
             <w:pPr>
-              <w:spacing w:after="0"/>
+              <w:spacing w:before="0" w:after="0" w:line="240" w:lineRule="auto"/>
+              <w:jc w:val="left"/>
             </w:pPr>
             <w:r>
               <w:rPr>
-                <w:sz w:val="14"/>
+                <w:rFonts w:ascii="Arial" w:hAnsi="Arial"/>
+                <w:b w:val="0"/>
+                <w:color w:val="000000"/>
+                <w:sz w:val="19"/>
               </w:rPr>
-              <w:t>Total energy trade</w:t>
+              <w:t>Non-fossil share</w:t>
             </w:r>
           </w:p>
         </w:tc>
         <w:tc>
           <w:tcPr>
-            <w:tcW w:type="dxa" w:w="1843"/>
-            <w:shd w:fill="FFFFFF"/>
+            <w:tcW w:type="dxa" w:w="5472"/>
+            <w:vAlign w:val="center"/>
+            <w:shd w:fill="EFF5F2"/>
             <w:tcBorders>
-              <w:top w:val="single" w:sz="4" w:color="D4CEC0"/>
-              <w:left w:val="single" w:sz="4" w:color="D4CEC0"/>
-              <w:bottom w:val="single" w:sz="4" w:color="D4CEC0"/>
-              <w:right w:val="single" w:sz="4" w:color="D4CEC0"/>
-              <w:insideH w:val="single" w:sz="4" w:color="D4CEC0"/>
-              <w:insideV w:val="single" w:sz="4" w:color="D4CEC0"/>
+              <w:top w:val="single" w:sz="4" w:color="D9D9D9"/>
+              <w:left w:val="single" w:sz="4" w:color="D9D9D9"/>
+              <w:bottom w:val="single" w:sz="4" w:color="D9D9D9"/>
+              <w:right w:val="single" w:sz="4" w:color="D9D9D9"/>
             </w:tcBorders>
-            <w:vAlign w:val="center"/>
+            <w:tcMar>
+              <w:top w:w="32" w:type="dxa"/>
+              <w:start w:w="55" w:type="dxa"/>
+              <w:bottom w:w="32" w:type="dxa"/>
+              <w:end w:w="55" w:type="dxa"/>
+            </w:tcMar>
           </w:tcPr>
           <w:p>
             <w:pPr>
-              <w:spacing w:after="0"/>
+              <w:spacing w:before="0" w:after="0" w:line="240" w:lineRule="auto"/>
+              <w:jc w:val="left"/>
             </w:pPr>
             <w:r>
               <w:rPr>
-                <w:sz w:val="14"/>
+                <w:rFonts w:ascii="Arial" w:hAnsi="Arial"/>
+                <w:b w:val="0"/>
+                <w:color w:val="000000"/>
+                <w:sz w:val="19"/>
               </w:rPr>
-              <w:t>2023</w:t>
+              <w:t>Solar, wind, hydro, and other share of domestic generation, percent.</w:t>
             </w:r>
           </w:p>
         </w:tc>
         <w:tc>
           <w:tcPr>
-            <w:tcW w:type="dxa" w:w="1699"/>
-            <w:shd w:fill="FFFFFF"/>
+            <w:tcW w:type="dxa" w:w="3053"/>
+            <w:vAlign w:val="center"/>
+            <w:shd w:fill="EFF5F2"/>
             <w:tcBorders>
-              <w:top w:val="single" w:sz="4" w:color="D4CEC0"/>
-              <w:left w:val="single" w:sz="4" w:color="D4CEC0"/>
-              <w:bottom w:val="single" w:sz="4" w:color="D4CEC0"/>
-              <w:right w:val="single" w:sz="4" w:color="D4CEC0"/>
-              <w:insideH w:val="single" w:sz="4" w:color="D4CEC0"/>
-              <w:insideV w:val="single" w:sz="4" w:color="D4CEC0"/>
+              <w:top w:val="single" w:sz="4" w:color="D9D9D9"/>
+              <w:left w:val="single" w:sz="4" w:color="D9D9D9"/>
+              <w:bottom w:val="single" w:sz="4" w:color="D9D9D9"/>
+              <w:right w:val="single" w:sz="4" w:color="D9D9D9"/>
             </w:tcBorders>
-            <w:vAlign w:val="center"/>
+            <w:tcMar>
+              <w:top w:w="32" w:type="dxa"/>
+              <w:start w:w="55" w:type="dxa"/>
+              <w:bottom w:w="32" w:type="dxa"/>
+              <w:end w:w="55" w:type="dxa"/>
+            </w:tcMar>
           </w:tcPr>
           <w:p>
             <w:pPr>
-              <w:spacing w:after="0"/>
+              <w:spacing w:before="0" w:after="0" w:line="240" w:lineRule="auto"/>
+              <w:jc w:val="left"/>
             </w:pPr>
             <w:r>
               <w:rPr>
-                <w:sz w:val="14"/>
+                <w:rFonts w:ascii="Arial" w:hAnsi="Arial"/>
+                <w:b w:val="0"/>
+                <w:color w:val="000000"/>
+                <w:sz w:val="19"/>
               </w:rPr>
-              <w:t>Exajoules</w:t>
+              <w:t>Our World in Data Energy CSV.</w:t>
+            </w:r>
+          </w:p>
+        </w:tc>
+      </w:tr>
+      <w:tr>
+        <w:tc>
+          <w:tcPr>
+            <w:tcW w:type="dxa" w:w="1987"/>
+            <w:vAlign w:val="center"/>
+            <w:shd w:fill="FFFFFF"/>
+            <w:tcBorders>
+              <w:top w:val="single" w:sz="4" w:color="D9D9D9"/>
+              <w:left w:val="single" w:sz="4" w:color="D9D9D9"/>
+              <w:bottom w:val="single" w:sz="4" w:color="D9D9D9"/>
+              <w:right w:val="single" w:sz="4" w:color="D9D9D9"/>
+            </w:tcBorders>
+            <w:tcMar>
+              <w:top w:w="32" w:type="dxa"/>
+              <w:start w:w="55" w:type="dxa"/>
+              <w:bottom w:w="32" w:type="dxa"/>
+              <w:end w:w="55" w:type="dxa"/>
+            </w:tcMar>
+          </w:tcPr>
+          <w:p>
+            <w:pPr>
+              <w:spacing w:before="0" w:after="0" w:line="240" w:lineRule="auto"/>
+              <w:jc w:val="left"/>
+            </w:pPr>
+            <w:r>
+              <w:rPr>
+                <w:rFonts w:ascii="Arial" w:hAnsi="Arial"/>
+                <w:b w:val="0"/>
+                <w:color w:val="000000"/>
+                <w:sz w:val="19"/>
+              </w:rPr>
+              <w:t>Energy scale</w:t>
             </w:r>
           </w:p>
         </w:tc>
         <w:tc>
           <w:tcPr>
-            <w:tcW w:type="dxa" w:w="4824"/>
+            <w:tcW w:type="dxa" w:w="5472"/>
+            <w:vAlign w:val="center"/>
             <w:shd w:fill="FFFFFF"/>
             <w:tcBorders>
-              <w:top w:val="single" w:sz="4" w:color="D4CEC0"/>
-              <w:left w:val="single" w:sz="4" w:color="D4CEC0"/>
-              <w:bottom w:val="single" w:sz="4" w:color="D4CEC0"/>
-              <w:right w:val="single" w:sz="4" w:color="D4CEC0"/>
-              <w:insideH w:val="single" w:sz="4" w:color="D4CEC0"/>
-              <w:insideV w:val="single" w:sz="4" w:color="D4CEC0"/>
+              <w:top w:val="single" w:sz="4" w:color="D9D9D9"/>
+              <w:left w:val="single" w:sz="4" w:color="D9D9D9"/>
+              <w:bottom w:val="single" w:sz="4" w:color="D9D9D9"/>
+              <w:right w:val="single" w:sz="4" w:color="D9D9D9"/>
             </w:tcBorders>
-            <w:vAlign w:val="center"/>
+            <w:tcMar>
+              <w:top w:w="32" w:type="dxa"/>
+              <w:start w:w="55" w:type="dxa"/>
+              <w:bottom w:w="32" w:type="dxa"/>
+              <w:end w:w="55" w:type="dxa"/>
+            </w:tcMar>
           </w:tcPr>
           <w:p>
             <w:pPr>
-              <w:spacing w:after="0"/>
+              <w:spacing w:before="0" w:after="0" w:line="240" w:lineRule="auto"/>
+              <w:jc w:val="left"/>
             </w:pPr>
             <w:r>
               <w:rPr>
-                <w:sz w:val="14"/>
+                <w:rFonts w:ascii="Arial" w:hAnsi="Arial"/>
+                <w:b w:val="0"/>
+                <w:color w:val="000000"/>
+                <w:sz w:val="19"/>
               </w:rPr>
-              <w:t>Gross cross-border flows; net imports equal imports minus exports</w:t>
+              <w:t>Total primary energy consumption, EJ.</w:t>
+            </w:r>
+          </w:p>
+        </w:tc>
+        <w:tc>
+          <w:tcPr>
+            <w:tcW w:type="dxa" w:w="3053"/>
+            <w:vAlign w:val="center"/>
+            <w:shd w:fill="FFFFFF"/>
+            <w:tcBorders>
+              <w:top w:val="single" w:sz="4" w:color="D9D9D9"/>
+              <w:left w:val="single" w:sz="4" w:color="D9D9D9"/>
+              <w:bottom w:val="single" w:sz="4" w:color="D9D9D9"/>
+              <w:right w:val="single" w:sz="4" w:color="D9D9D9"/>
+            </w:tcBorders>
+            <w:tcMar>
+              <w:top w:w="32" w:type="dxa"/>
+              <w:start w:w="55" w:type="dxa"/>
+              <w:bottom w:w="32" w:type="dxa"/>
+              <w:end w:w="55" w:type="dxa"/>
+            </w:tcMar>
+          </w:tcPr>
+          <w:p>
+            <w:pPr>
+              <w:spacing w:before="0" w:after="0" w:line="240" w:lineRule="auto"/>
+              <w:jc w:val="left"/>
+            </w:pPr>
+            <w:r>
+              <w:rPr>
+                <w:rFonts w:ascii="Arial" w:hAnsi="Arial"/>
+                <w:b w:val="0"/>
+                <w:color w:val="000000"/>
+                <w:sz w:val="19"/>
+              </w:rPr>
+              <w:t>Assignment sources or Our World in Data.</w:t>
+            </w:r>
+          </w:p>
+        </w:tc>
+      </w:tr>
+      <w:tr>
+        <w:tc>
+          <w:tcPr>
+            <w:tcW w:type="dxa" w:w="1987"/>
+            <w:vAlign w:val="center"/>
+            <w:shd w:fill="EFF5F2"/>
+            <w:tcBorders>
+              <w:top w:val="single" w:sz="4" w:color="D9D9D9"/>
+              <w:left w:val="single" w:sz="4" w:color="D9D9D9"/>
+              <w:bottom w:val="single" w:sz="4" w:color="D9D9D9"/>
+              <w:right w:val="single" w:sz="4" w:color="D9D9D9"/>
+            </w:tcBorders>
+            <w:tcMar>
+              <w:top w:w="32" w:type="dxa"/>
+              <w:start w:w="55" w:type="dxa"/>
+              <w:bottom w:w="32" w:type="dxa"/>
+              <w:end w:w="55" w:type="dxa"/>
+            </w:tcMar>
+          </w:tcPr>
+          <w:p>
+            <w:pPr>
+              <w:spacing w:before="0" w:after="0" w:line="240" w:lineRule="auto"/>
+              <w:jc w:val="left"/>
+            </w:pPr>
+            <w:r>
+              <w:rPr>
+                <w:rFonts w:ascii="Arial" w:hAnsi="Arial"/>
+                <w:b w:val="0"/>
+                <w:color w:val="000000"/>
+                <w:sz w:val="19"/>
+              </w:rPr>
+              <w:t>Trade or balance</w:t>
+            </w:r>
+          </w:p>
+        </w:tc>
+        <w:tc>
+          <w:tcPr>
+            <w:tcW w:type="dxa" w:w="5472"/>
+            <w:vAlign w:val="center"/>
+            <w:shd w:fill="EFF5F2"/>
+            <w:tcBorders>
+              <w:top w:val="single" w:sz="4" w:color="D9D9D9"/>
+              <w:left w:val="single" w:sz="4" w:color="D9D9D9"/>
+              <w:bottom w:val="single" w:sz="4" w:color="D9D9D9"/>
+              <w:right w:val="single" w:sz="4" w:color="D9D9D9"/>
+            </w:tcBorders>
+            <w:tcMar>
+              <w:top w:w="32" w:type="dxa"/>
+              <w:start w:w="55" w:type="dxa"/>
+              <w:bottom w:w="32" w:type="dxa"/>
+              <w:end w:w="55" w:type="dxa"/>
+            </w:tcMar>
+          </w:tcPr>
+          <w:p>
+            <w:pPr>
+              <w:spacing w:before="0" w:after="0" w:line="240" w:lineRule="auto"/>
+              <w:jc w:val="left"/>
+            </w:pPr>
+            <w:r>
+              <w:rPr>
+                <w:rFonts w:ascii="Arial" w:hAnsi="Arial"/>
+                <w:b w:val="0"/>
+                <w:color w:val="000000"/>
+                <w:sz w:val="19"/>
+              </w:rPr>
+              <w:t>Reported net imports for Assignment 15; derived balance gap for Expanded 50, EJ.</w:t>
+            </w:r>
+          </w:p>
+        </w:tc>
+        <w:tc>
+          <w:tcPr>
+            <w:tcW w:type="dxa" w:w="3053"/>
+            <w:vAlign w:val="center"/>
+            <w:shd w:fill="EFF5F2"/>
+            <w:tcBorders>
+              <w:top w:val="single" w:sz="4" w:color="D9D9D9"/>
+              <w:left w:val="single" w:sz="4" w:color="D9D9D9"/>
+              <w:bottom w:val="single" w:sz="4" w:color="D9D9D9"/>
+              <w:right w:val="single" w:sz="4" w:color="D9D9D9"/>
+            </w:tcBorders>
+            <w:tcMar>
+              <w:top w:w="32" w:type="dxa"/>
+              <w:start w:w="55" w:type="dxa"/>
+              <w:bottom w:w="32" w:type="dxa"/>
+              <w:end w:w="55" w:type="dxa"/>
+            </w:tcMar>
+          </w:tcPr>
+          <w:p>
+            <w:pPr>
+              <w:spacing w:before="0" w:after="0" w:line="240" w:lineRule="auto"/>
+              <w:jc w:val="left"/>
+            </w:pPr>
+            <w:r>
+              <w:rPr>
+                <w:rFonts w:ascii="Arial" w:hAnsi="Arial"/>
+                <w:b w:val="0"/>
+                <w:color w:val="000000"/>
+                <w:sz w:val="19"/>
+              </w:rPr>
+              <w:t>Assignment source or EIA International.</w:t>
             </w:r>
           </w:p>
         </w:tc>
@@ -601,20 +909,25 @@
     </w:tbl>
     <w:p>
       <w:pPr>
+        <w:spacing w:after="0" w:line="60" w:lineRule="auto"/>
+      </w:pPr>
+    </w:p>
+    <w:p>
+      <w:pPr>
         <w:pStyle w:val="Heading1"/>
       </w:pPr>
       <w:r>
-        <w:t>Validation and derived measures</w:t>
+        <w:t>Coverage and aggregation</w:t>
       </w:r>
     </w:p>
     <w:p>
       <w:r>
-        <w:t>The parser requires 15 unique country rows and 49 named columns. It checks numeric fields, URLs, percentages from 0 to 100, and electricity and primary energy mix totals within 0.11 percentage points of 100. It also verifies that Iran is the only record with both USD price fields missing. The stored file has SHA-256 c6a83dd39fd0215a4ddcf5d11e15f6b3c36197230b326c2425588ee8067e7caa.</w:t>
+        <w:t>Expanded 50 covers household price in 47/50 markets and business price in 45/50. Consumption, electricity mix, and the balance gap each cover 47/50. A fallback may use a value up to two years earlier and remains flagged. Missing values stay N/A.</w:t>
       </w:r>
     </w:p>
     <w:p>
       <w:r>
-        <w:t>Non-fossil electricity equals solar + wind + hydro + other. Fossil electricity equals gas + coal + oil and other fossil. Selected price uses the household or business field chosen by the user. Positive net imports indicate a net importer; negative values indicate a net exporter. Missing values display as N/A and leave any calculation that requires the missing metric.</w:t>
+        <w:t>Regional price uses the unweighted member median. Consumption and balance sum available member values. Regional electricity mix weights member shares by domestic generation. The interface reports overlapping region membership and calculates Pearson r from at least five complete pairs.</w:t>
       </w:r>
     </w:p>
     <w:p>
@@ -622,86 +935,737 @@
         <w:pStyle w:val="Heading1"/>
       </w:pPr>
       <w:r>
-        <w:t>Bias uncertainty and limitations</w:t>
+        <w:t>Analysis maturity</w:t>
       </w:r>
     </w:p>
+    <w:tbl>
+      <w:tblPr>
+        <w:tblW w:type="auto" w:w="0"/>
+        <w:tblLayout w:type="fixed"/>
+        <w:tblLook w:firstColumn="1" w:firstRow="1" w:lastColumn="0" w:lastRow="0" w:noHBand="0" w:noVBand="1" w:val="04A0"/>
+      </w:tblPr>
+      <w:tblGrid>
+        <w:gridCol w:w="2714"/>
+        <w:gridCol w:w="2714"/>
+        <w:gridCol w:w="2714"/>
+        <w:gridCol w:w="2714"/>
+      </w:tblGrid>
+      <w:tr>
+        <w:trPr>
+          <w:tblHeader w:val="true"/>
+        </w:trPr>
+        <w:tc>
+          <w:tcPr>
+            <w:tcW w:type="dxa" w:w="1440"/>
+            <w:vAlign w:val="center"/>
+            <w:shd w:fill="213B52"/>
+            <w:tcBorders>
+              <w:top w:val="single" w:sz="4" w:color="D9D9D9"/>
+              <w:left w:val="single" w:sz="4" w:color="D9D9D9"/>
+              <w:bottom w:val="single" w:sz="4" w:color="D9D9D9"/>
+              <w:right w:val="single" w:sz="4" w:color="D9D9D9"/>
+            </w:tcBorders>
+            <w:tcMar>
+              <w:top w:w="32" w:type="dxa"/>
+              <w:start w:w="55" w:type="dxa"/>
+              <w:bottom w:w="32" w:type="dxa"/>
+              <w:end w:w="55" w:type="dxa"/>
+            </w:tcMar>
+          </w:tcPr>
+          <w:p>
+            <w:pPr>
+              <w:spacing w:before="0" w:after="0" w:line="240" w:lineRule="auto"/>
+              <w:jc w:val="left"/>
+            </w:pPr>
+            <w:r>
+              <w:rPr>
+                <w:rFonts w:ascii="Arial" w:hAnsi="Arial"/>
+                <w:b/>
+                <w:color w:val="FFFFFF"/>
+                <w:sz w:val="19"/>
+              </w:rPr>
+              <w:t>Level</w:t>
+            </w:r>
+          </w:p>
+        </w:tc>
+        <w:tc>
+          <w:tcPr>
+            <w:tcW w:type="dxa" w:w="1512"/>
+            <w:vAlign w:val="center"/>
+            <w:shd w:fill="213B52"/>
+            <w:tcBorders>
+              <w:top w:val="single" w:sz="4" w:color="D9D9D9"/>
+              <w:left w:val="single" w:sz="4" w:color="D9D9D9"/>
+              <w:bottom w:val="single" w:sz="4" w:color="D9D9D9"/>
+              <w:right w:val="single" w:sz="4" w:color="D9D9D9"/>
+            </w:tcBorders>
+            <w:tcMar>
+              <w:top w:w="32" w:type="dxa"/>
+              <w:start w:w="55" w:type="dxa"/>
+              <w:bottom w:w="32" w:type="dxa"/>
+              <w:end w:w="55" w:type="dxa"/>
+            </w:tcMar>
+          </w:tcPr>
+          <w:p>
+            <w:pPr>
+              <w:spacing w:before="0" w:after="0" w:line="240" w:lineRule="auto"/>
+              <w:jc w:val="left"/>
+            </w:pPr>
+            <w:r>
+              <w:rPr>
+                <w:rFonts w:ascii="Arial" w:hAnsi="Arial"/>
+                <w:b/>
+                <w:color w:val="FFFFFF"/>
+                <w:sz w:val="19"/>
+              </w:rPr>
+              <w:t>Status</w:t>
+            </w:r>
+          </w:p>
+        </w:tc>
+        <w:tc>
+          <w:tcPr>
+            <w:tcW w:type="dxa" w:w="3888"/>
+            <w:vAlign w:val="center"/>
+            <w:shd w:fill="213B52"/>
+            <w:tcBorders>
+              <w:top w:val="single" w:sz="4" w:color="D9D9D9"/>
+              <w:left w:val="single" w:sz="4" w:color="D9D9D9"/>
+              <w:bottom w:val="single" w:sz="4" w:color="D9D9D9"/>
+              <w:right w:val="single" w:sz="4" w:color="D9D9D9"/>
+            </w:tcBorders>
+            <w:tcMar>
+              <w:top w:w="32" w:type="dxa"/>
+              <w:start w:w="55" w:type="dxa"/>
+              <w:bottom w:w="32" w:type="dxa"/>
+              <w:end w:w="55" w:type="dxa"/>
+            </w:tcMar>
+          </w:tcPr>
+          <w:p>
+            <w:pPr>
+              <w:spacing w:before="0" w:after="0" w:line="240" w:lineRule="auto"/>
+              <w:jc w:val="left"/>
+            </w:pPr>
+            <w:r>
+              <w:rPr>
+                <w:rFonts w:ascii="Arial" w:hAnsi="Arial"/>
+                <w:b/>
+                <w:color w:val="FFFFFF"/>
+                <w:sz w:val="19"/>
+              </w:rPr>
+              <w:t>What this work supports</w:t>
+            </w:r>
+          </w:p>
+        </w:tc>
+        <w:tc>
+          <w:tcPr>
+            <w:tcW w:type="dxa" w:w="3672"/>
+            <w:vAlign w:val="center"/>
+            <w:shd w:fill="213B52"/>
+            <w:tcBorders>
+              <w:top w:val="single" w:sz="4" w:color="D9D9D9"/>
+              <w:left w:val="single" w:sz="4" w:color="D9D9D9"/>
+              <w:bottom w:val="single" w:sz="4" w:color="D9D9D9"/>
+              <w:right w:val="single" w:sz="4" w:color="D9D9D9"/>
+            </w:tcBorders>
+            <w:tcMar>
+              <w:top w:w="32" w:type="dxa"/>
+              <w:start w:w="55" w:type="dxa"/>
+              <w:bottom w:w="32" w:type="dxa"/>
+              <w:end w:w="55" w:type="dxa"/>
+            </w:tcMar>
+          </w:tcPr>
+          <w:p>
+            <w:pPr>
+              <w:spacing w:before="0" w:after="0" w:line="240" w:lineRule="auto"/>
+              <w:jc w:val="left"/>
+            </w:pPr>
+            <w:r>
+              <w:rPr>
+                <w:rFonts w:ascii="Arial" w:hAnsi="Arial"/>
+                <w:b/>
+                <w:color w:val="FFFFFF"/>
+                <w:sz w:val="19"/>
+              </w:rPr>
+              <w:t>What it does not prove</w:t>
+            </w:r>
+          </w:p>
+        </w:tc>
+      </w:tr>
+      <w:tr>
+        <w:tc>
+          <w:tcPr>
+            <w:tcW w:type="dxa" w:w="1440"/>
+            <w:vAlign w:val="center"/>
+            <w:shd w:fill="FFFFFF"/>
+            <w:tcBorders>
+              <w:top w:val="single" w:sz="4" w:color="D9D9D9"/>
+              <w:left w:val="single" w:sz="4" w:color="D9D9D9"/>
+              <w:bottom w:val="single" w:sz="4" w:color="D9D9D9"/>
+              <w:right w:val="single" w:sz="4" w:color="D9D9D9"/>
+            </w:tcBorders>
+            <w:tcMar>
+              <w:top w:w="32" w:type="dxa"/>
+              <w:start w:w="55" w:type="dxa"/>
+              <w:bottom w:w="32" w:type="dxa"/>
+              <w:end w:w="55" w:type="dxa"/>
+            </w:tcMar>
+          </w:tcPr>
+          <w:p>
+            <w:pPr>
+              <w:spacing w:before="0" w:after="0" w:line="240" w:lineRule="auto"/>
+              <w:jc w:val="left"/>
+            </w:pPr>
+            <w:r>
+              <w:rPr>
+                <w:rFonts w:ascii="Arial" w:hAnsi="Arial"/>
+                <w:b w:val="0"/>
+                <w:color w:val="000000"/>
+                <w:sz w:val="19"/>
+              </w:rPr>
+              <w:t>Descriptive</w:t>
+            </w:r>
+          </w:p>
+        </w:tc>
+        <w:tc>
+          <w:tcPr>
+            <w:tcW w:type="dxa" w:w="1512"/>
+            <w:vAlign w:val="center"/>
+            <w:shd w:fill="FFFFFF"/>
+            <w:tcBorders>
+              <w:top w:val="single" w:sz="4" w:color="D9D9D9"/>
+              <w:left w:val="single" w:sz="4" w:color="D9D9D9"/>
+              <w:bottom w:val="single" w:sz="4" w:color="D9D9D9"/>
+              <w:right w:val="single" w:sz="4" w:color="D9D9D9"/>
+            </w:tcBorders>
+            <w:tcMar>
+              <w:top w:w="32" w:type="dxa"/>
+              <w:start w:w="55" w:type="dxa"/>
+              <w:bottom w:w="32" w:type="dxa"/>
+              <w:end w:w="55" w:type="dxa"/>
+            </w:tcMar>
+          </w:tcPr>
+          <w:p>
+            <w:pPr>
+              <w:spacing w:before="0" w:after="0" w:line="240" w:lineRule="auto"/>
+              <w:jc w:val="left"/>
+            </w:pPr>
+            <w:r>
+              <w:rPr>
+                <w:rFonts w:ascii="Arial" w:hAnsi="Arial"/>
+                <w:b w:val="0"/>
+                <w:color w:val="000000"/>
+                <w:sz w:val="19"/>
+              </w:rPr>
+              <w:t>performed</w:t>
+            </w:r>
+          </w:p>
+        </w:tc>
+        <w:tc>
+          <w:tcPr>
+            <w:tcW w:type="dxa" w:w="3888"/>
+            <w:vAlign w:val="center"/>
+            <w:shd w:fill="FFFFFF"/>
+            <w:tcBorders>
+              <w:top w:val="single" w:sz="4" w:color="D9D9D9"/>
+              <w:left w:val="single" w:sz="4" w:color="D9D9D9"/>
+              <w:bottom w:val="single" w:sz="4" w:color="D9D9D9"/>
+              <w:right w:val="single" w:sz="4" w:color="D9D9D9"/>
+            </w:tcBorders>
+            <w:tcMar>
+              <w:top w:w="32" w:type="dxa"/>
+              <w:start w:w="55" w:type="dxa"/>
+              <w:bottom w:w="32" w:type="dxa"/>
+              <w:end w:w="55" w:type="dxa"/>
+            </w:tcMar>
+          </w:tcPr>
+          <w:p>
+            <w:pPr>
+              <w:spacing w:before="0" w:after="0" w:line="240" w:lineRule="auto"/>
+              <w:jc w:val="left"/>
+            </w:pPr>
+            <w:r>
+              <w:rPr>
+                <w:rFonts w:ascii="Arial" w:hAnsi="Arial"/>
+                <w:b w:val="0"/>
+                <w:color w:val="000000"/>
+                <w:sz w:val="19"/>
+              </w:rPr>
+              <w:t>Coverage, extrema, rankings, concentration, complete-case correlations, and fixed comparisons.</w:t>
+            </w:r>
+          </w:p>
+        </w:tc>
+        <w:tc>
+          <w:tcPr>
+            <w:tcW w:type="dxa" w:w="3672"/>
+            <w:vAlign w:val="center"/>
+            <w:shd w:fill="FFFFFF"/>
+            <w:tcBorders>
+              <w:top w:val="single" w:sz="4" w:color="D9D9D9"/>
+              <w:left w:val="single" w:sz="4" w:color="D9D9D9"/>
+              <w:bottom w:val="single" w:sz="4" w:color="D9D9D9"/>
+              <w:right w:val="single" w:sz="4" w:color="D9D9D9"/>
+            </w:tcBorders>
+            <w:tcMar>
+              <w:top w:w="32" w:type="dxa"/>
+              <w:start w:w="55" w:type="dxa"/>
+              <w:bottom w:w="32" w:type="dxa"/>
+              <w:end w:w="55" w:type="dxa"/>
+            </w:tcMar>
+          </w:tcPr>
+          <w:p>
+            <w:pPr>
+              <w:spacing w:before="0" w:after="0" w:line="240" w:lineRule="auto"/>
+              <w:jc w:val="left"/>
+            </w:pPr>
+            <w:r>
+              <w:rPr>
+                <w:rFonts w:ascii="Arial" w:hAnsi="Arial"/>
+                <w:b w:val="0"/>
+                <w:color w:val="000000"/>
+                <w:sz w:val="19"/>
+              </w:rPr>
+              <w:t>Causation, future outcomes, or an optimal market.</w:t>
+            </w:r>
+          </w:p>
+        </w:tc>
+      </w:tr>
+      <w:tr>
+        <w:tc>
+          <w:tcPr>
+            <w:tcW w:type="dxa" w:w="1440"/>
+            <w:vAlign w:val="center"/>
+            <w:shd w:fill="EFF5F2"/>
+            <w:tcBorders>
+              <w:top w:val="single" w:sz="4" w:color="D9D9D9"/>
+              <w:left w:val="single" w:sz="4" w:color="D9D9D9"/>
+              <w:bottom w:val="single" w:sz="4" w:color="D9D9D9"/>
+              <w:right w:val="single" w:sz="4" w:color="D9D9D9"/>
+            </w:tcBorders>
+            <w:tcMar>
+              <w:top w:w="32" w:type="dxa"/>
+              <w:start w:w="55" w:type="dxa"/>
+              <w:bottom w:w="32" w:type="dxa"/>
+              <w:end w:w="55" w:type="dxa"/>
+            </w:tcMar>
+          </w:tcPr>
+          <w:p>
+            <w:pPr>
+              <w:spacing w:before="0" w:after="0" w:line="240" w:lineRule="auto"/>
+              <w:jc w:val="left"/>
+            </w:pPr>
+            <w:r>
+              <w:rPr>
+                <w:rFonts w:ascii="Arial" w:hAnsi="Arial"/>
+                <w:b w:val="0"/>
+                <w:color w:val="000000"/>
+                <w:sz w:val="19"/>
+              </w:rPr>
+              <w:t>Diagnostic</w:t>
+            </w:r>
+          </w:p>
+        </w:tc>
+        <w:tc>
+          <w:tcPr>
+            <w:tcW w:type="dxa" w:w="1512"/>
+            <w:vAlign w:val="center"/>
+            <w:shd w:fill="EFF5F2"/>
+            <w:tcBorders>
+              <w:top w:val="single" w:sz="4" w:color="D9D9D9"/>
+              <w:left w:val="single" w:sz="4" w:color="D9D9D9"/>
+              <w:bottom w:val="single" w:sz="4" w:color="D9D9D9"/>
+              <w:right w:val="single" w:sz="4" w:color="D9D9D9"/>
+            </w:tcBorders>
+            <w:tcMar>
+              <w:top w:w="32" w:type="dxa"/>
+              <w:start w:w="55" w:type="dxa"/>
+              <w:bottom w:w="32" w:type="dxa"/>
+              <w:end w:w="55" w:type="dxa"/>
+            </w:tcMar>
+          </w:tcPr>
+          <w:p>
+            <w:pPr>
+              <w:spacing w:before="0" w:after="0" w:line="240" w:lineRule="auto"/>
+              <w:jc w:val="left"/>
+            </w:pPr>
+            <w:r>
+              <w:rPr>
+                <w:rFonts w:ascii="Arial" w:hAnsi="Arial"/>
+                <w:b w:val="0"/>
+                <w:color w:val="000000"/>
+                <w:sz w:val="19"/>
+              </w:rPr>
+              <w:t>partial</w:t>
+            </w:r>
+          </w:p>
+        </w:tc>
+        <w:tc>
+          <w:tcPr>
+            <w:tcW w:type="dxa" w:w="3888"/>
+            <w:vAlign w:val="center"/>
+            <w:shd w:fill="EFF5F2"/>
+            <w:tcBorders>
+              <w:top w:val="single" w:sz="4" w:color="D9D9D9"/>
+              <w:left w:val="single" w:sz="4" w:color="D9D9D9"/>
+              <w:bottom w:val="single" w:sz="4" w:color="D9D9D9"/>
+              <w:right w:val="single" w:sz="4" w:color="D9D9D9"/>
+            </w:tcBorders>
+            <w:tcMar>
+              <w:top w:w="32" w:type="dxa"/>
+              <w:start w:w="55" w:type="dxa"/>
+              <w:bottom w:w="32" w:type="dxa"/>
+              <w:end w:w="55" w:type="dxa"/>
+            </w:tcMar>
+          </w:tcPr>
+          <w:p>
+            <w:pPr>
+              <w:spacing w:before="0" w:after="0" w:line="240" w:lineRule="auto"/>
+              <w:jc w:val="left"/>
+            </w:pPr>
+            <w:r>
+              <w:rPr>
+                <w:rFonts w:ascii="Arial" w:hAnsi="Arial"/>
+                <w:b w:val="0"/>
+                <w:color w:val="000000"/>
+                <w:sz w:val="19"/>
+              </w:rPr>
+              <w:t>Associations and external context can form hypotheses and local questions.</w:t>
+            </w:r>
+          </w:p>
+        </w:tc>
+        <w:tc>
+          <w:tcPr>
+            <w:tcW w:type="dxa" w:w="3672"/>
+            <w:vAlign w:val="center"/>
+            <w:shd w:fill="EFF5F2"/>
+            <w:tcBorders>
+              <w:top w:val="single" w:sz="4" w:color="D9D9D9"/>
+              <w:left w:val="single" w:sz="4" w:color="D9D9D9"/>
+              <w:bottom w:val="single" w:sz="4" w:color="D9D9D9"/>
+              <w:right w:val="single" w:sz="4" w:color="D9D9D9"/>
+            </w:tcBorders>
+            <w:tcMar>
+              <w:top w:w="32" w:type="dxa"/>
+              <w:start w:w="55" w:type="dxa"/>
+              <w:bottom w:w="32" w:type="dxa"/>
+              <w:end w:w="55" w:type="dxa"/>
+            </w:tcMar>
+          </w:tcPr>
+          <w:p>
+            <w:pPr>
+              <w:spacing w:before="0" w:after="0" w:line="240" w:lineRule="auto"/>
+              <w:jc w:val="left"/>
+            </w:pPr>
+            <w:r>
+              <w:rPr>
+                <w:rFonts w:ascii="Arial" w:hAnsi="Arial"/>
+                <w:b w:val="0"/>
+                <w:color w:val="000000"/>
+                <w:sz w:val="19"/>
+              </w:rPr>
+              <w:t>Why an observed price, mix, demand, reliability, or balance value occurred.</w:t>
+            </w:r>
+          </w:p>
+        </w:tc>
+      </w:tr>
+      <w:tr>
+        <w:tc>
+          <w:tcPr>
+            <w:tcW w:type="dxa" w:w="1440"/>
+            <w:vAlign w:val="center"/>
+            <w:shd w:fill="FFFFFF"/>
+            <w:tcBorders>
+              <w:top w:val="single" w:sz="4" w:color="D9D9D9"/>
+              <w:left w:val="single" w:sz="4" w:color="D9D9D9"/>
+              <w:bottom w:val="single" w:sz="4" w:color="D9D9D9"/>
+              <w:right w:val="single" w:sz="4" w:color="D9D9D9"/>
+            </w:tcBorders>
+            <w:tcMar>
+              <w:top w:w="32" w:type="dxa"/>
+              <w:start w:w="55" w:type="dxa"/>
+              <w:bottom w:w="32" w:type="dxa"/>
+              <w:end w:w="55" w:type="dxa"/>
+            </w:tcMar>
+          </w:tcPr>
+          <w:p>
+            <w:pPr>
+              <w:spacing w:before="0" w:after="0" w:line="240" w:lineRule="auto"/>
+              <w:jc w:val="left"/>
+            </w:pPr>
+            <w:r>
+              <w:rPr>
+                <w:rFonts w:ascii="Arial" w:hAnsi="Arial"/>
+                <w:b w:val="0"/>
+                <w:color w:val="000000"/>
+                <w:sz w:val="19"/>
+              </w:rPr>
+              <w:t>Predictive</w:t>
+            </w:r>
+          </w:p>
+        </w:tc>
+        <w:tc>
+          <w:tcPr>
+            <w:tcW w:type="dxa" w:w="1512"/>
+            <w:vAlign w:val="center"/>
+            <w:shd w:fill="FFFFFF"/>
+            <w:tcBorders>
+              <w:top w:val="single" w:sz="4" w:color="D9D9D9"/>
+              <w:left w:val="single" w:sz="4" w:color="D9D9D9"/>
+              <w:bottom w:val="single" w:sz="4" w:color="D9D9D9"/>
+              <w:right w:val="single" w:sz="4" w:color="D9D9D9"/>
+            </w:tcBorders>
+            <w:tcMar>
+              <w:top w:w="32" w:type="dxa"/>
+              <w:start w:w="55" w:type="dxa"/>
+              <w:bottom w:w="32" w:type="dxa"/>
+              <w:end w:w="55" w:type="dxa"/>
+            </w:tcMar>
+          </w:tcPr>
+          <w:p>
+            <w:pPr>
+              <w:spacing w:before="0" w:after="0" w:line="240" w:lineRule="auto"/>
+              <w:jc w:val="left"/>
+            </w:pPr>
+            <w:r>
+              <w:rPr>
+                <w:rFonts w:ascii="Arial" w:hAnsi="Arial"/>
+                <w:b w:val="0"/>
+                <w:color w:val="000000"/>
+                <w:sz w:val="19"/>
+              </w:rPr>
+              <w:t>not performed</w:t>
+            </w:r>
+          </w:p>
+        </w:tc>
+        <w:tc>
+          <w:tcPr>
+            <w:tcW w:type="dxa" w:w="3888"/>
+            <w:vAlign w:val="center"/>
+            <w:shd w:fill="FFFFFF"/>
+            <w:tcBorders>
+              <w:top w:val="single" w:sz="4" w:color="D9D9D9"/>
+              <w:left w:val="single" w:sz="4" w:color="D9D9D9"/>
+              <w:bottom w:val="single" w:sz="4" w:color="D9D9D9"/>
+              <w:right w:val="single" w:sz="4" w:color="D9D9D9"/>
+            </w:tcBorders>
+            <w:tcMar>
+              <w:top w:w="32" w:type="dxa"/>
+              <w:start w:w="55" w:type="dxa"/>
+              <w:bottom w:w="32" w:type="dxa"/>
+              <w:end w:w="55" w:type="dxa"/>
+            </w:tcMar>
+          </w:tcPr>
+          <w:p>
+            <w:pPr>
+              <w:spacing w:before="0" w:after="0" w:line="240" w:lineRule="auto"/>
+              <w:jc w:val="left"/>
+            </w:pPr>
+            <w:r>
+              <w:rPr>
+                <w:rFonts w:ascii="Arial" w:hAnsi="Arial"/>
+                <w:b w:val="0"/>
+                <w:color w:val="000000"/>
+                <w:sz w:val="19"/>
+              </w:rPr>
+              <w:t>The snapshot establishes a baseline for later forecast design.</w:t>
+            </w:r>
+          </w:p>
+        </w:tc>
+        <w:tc>
+          <w:tcPr>
+            <w:tcW w:type="dxa" w:w="3672"/>
+            <w:vAlign w:val="center"/>
+            <w:shd w:fill="FFFFFF"/>
+            <w:tcBorders>
+              <w:top w:val="single" w:sz="4" w:color="D9D9D9"/>
+              <w:left w:val="single" w:sz="4" w:color="D9D9D9"/>
+              <w:bottom w:val="single" w:sz="4" w:color="D9D9D9"/>
+              <w:right w:val="single" w:sz="4" w:color="D9D9D9"/>
+            </w:tcBorders>
+            <w:tcMar>
+              <w:top w:w="32" w:type="dxa"/>
+              <w:start w:w="55" w:type="dxa"/>
+              <w:bottom w:w="32" w:type="dxa"/>
+              <w:end w:w="55" w:type="dxa"/>
+            </w:tcMar>
+          </w:tcPr>
+          <w:p>
+            <w:pPr>
+              <w:spacing w:before="0" w:after="0" w:line="240" w:lineRule="auto"/>
+              <w:jc w:val="left"/>
+            </w:pPr>
+            <w:r>
+              <w:rPr>
+                <w:rFonts w:ascii="Arial" w:hAnsi="Arial"/>
+                <w:b w:val="0"/>
+                <w:color w:val="000000"/>
+                <w:sz w:val="19"/>
+              </w:rPr>
+              <w:t>Future electricity prices, demand, reliability, or emissions.</w:t>
+            </w:r>
+          </w:p>
+        </w:tc>
+      </w:tr>
+      <w:tr>
+        <w:tc>
+          <w:tcPr>
+            <w:tcW w:type="dxa" w:w="1440"/>
+            <w:vAlign w:val="center"/>
+            <w:shd w:fill="EFF5F2"/>
+            <w:tcBorders>
+              <w:top w:val="single" w:sz="4" w:color="D9D9D9"/>
+              <w:left w:val="single" w:sz="4" w:color="D9D9D9"/>
+              <w:bottom w:val="single" w:sz="4" w:color="D9D9D9"/>
+              <w:right w:val="single" w:sz="4" w:color="D9D9D9"/>
+            </w:tcBorders>
+            <w:tcMar>
+              <w:top w:w="32" w:type="dxa"/>
+              <w:start w:w="55" w:type="dxa"/>
+              <w:bottom w:w="32" w:type="dxa"/>
+              <w:end w:w="55" w:type="dxa"/>
+            </w:tcMar>
+          </w:tcPr>
+          <w:p>
+            <w:pPr>
+              <w:spacing w:before="0" w:after="0" w:line="240" w:lineRule="auto"/>
+              <w:jc w:val="left"/>
+            </w:pPr>
+            <w:r>
+              <w:rPr>
+                <w:rFonts w:ascii="Arial" w:hAnsi="Arial"/>
+                <w:b w:val="0"/>
+                <w:color w:val="000000"/>
+                <w:sz w:val="19"/>
+              </w:rPr>
+              <w:t>Prescriptive</w:t>
+            </w:r>
+          </w:p>
+        </w:tc>
+        <w:tc>
+          <w:tcPr>
+            <w:tcW w:type="dxa" w:w="1512"/>
+            <w:vAlign w:val="center"/>
+            <w:shd w:fill="EFF5F2"/>
+            <w:tcBorders>
+              <w:top w:val="single" w:sz="4" w:color="D9D9D9"/>
+              <w:left w:val="single" w:sz="4" w:color="D9D9D9"/>
+              <w:bottom w:val="single" w:sz="4" w:color="D9D9D9"/>
+              <w:right w:val="single" w:sz="4" w:color="D9D9D9"/>
+            </w:tcBorders>
+            <w:tcMar>
+              <w:top w:w="32" w:type="dxa"/>
+              <w:start w:w="55" w:type="dxa"/>
+              <w:bottom w:w="32" w:type="dxa"/>
+              <w:end w:w="55" w:type="dxa"/>
+            </w:tcMar>
+          </w:tcPr>
+          <w:p>
+            <w:pPr>
+              <w:spacing w:before="0" w:after="0" w:line="240" w:lineRule="auto"/>
+              <w:jc w:val="left"/>
+            </w:pPr>
+            <w:r>
+              <w:rPr>
+                <w:rFonts w:ascii="Arial" w:hAnsi="Arial"/>
+                <w:b w:val="0"/>
+                <w:color w:val="000000"/>
+                <w:sz w:val="19"/>
+              </w:rPr>
+              <w:t>not performed</w:t>
+            </w:r>
+          </w:p>
+        </w:tc>
+        <w:tc>
+          <w:tcPr>
+            <w:tcW w:type="dxa" w:w="3888"/>
+            <w:vAlign w:val="center"/>
+            <w:shd w:fill="EFF5F2"/>
+            <w:tcBorders>
+              <w:top w:val="single" w:sz="4" w:color="D9D9D9"/>
+              <w:left w:val="single" w:sz="4" w:color="D9D9D9"/>
+              <w:bottom w:val="single" w:sz="4" w:color="D9D9D9"/>
+              <w:right w:val="single" w:sz="4" w:color="D9D9D9"/>
+            </w:tcBorders>
+            <w:tcMar>
+              <w:top w:w="32" w:type="dxa"/>
+              <w:start w:w="55" w:type="dxa"/>
+              <w:bottom w:w="32" w:type="dxa"/>
+              <w:end w:w="55" w:type="dxa"/>
+            </w:tcMar>
+          </w:tcPr>
+          <w:p>
+            <w:pPr>
+              <w:spacing w:before="0" w:after="0" w:line="240" w:lineRule="auto"/>
+              <w:jc w:val="left"/>
+            </w:pPr>
+            <w:r>
+              <w:rPr>
+                <w:rFonts w:ascii="Arial" w:hAnsi="Arial"/>
+                <w:b w:val="0"/>
+                <w:color w:val="000000"/>
+                <w:sz w:val="19"/>
+              </w:rPr>
+              <w:t>A diligence shortlist can order follow-up work.</w:t>
+            </w:r>
+          </w:p>
+        </w:tc>
+        <w:tc>
+          <w:tcPr>
+            <w:tcW w:type="dxa" w:w="3672"/>
+            <w:vAlign w:val="center"/>
+            <w:shd w:fill="EFF5F2"/>
+            <w:tcBorders>
+              <w:top w:val="single" w:sz="4" w:color="D9D9D9"/>
+              <w:left w:val="single" w:sz="4" w:color="D9D9D9"/>
+              <w:bottom w:val="single" w:sz="4" w:color="D9D9D9"/>
+              <w:right w:val="single" w:sz="4" w:color="D9D9D9"/>
+            </w:tcBorders>
+            <w:tcMar>
+              <w:top w:w="32" w:type="dxa"/>
+              <w:start w:w="55" w:type="dxa"/>
+              <w:bottom w:w="32" w:type="dxa"/>
+              <w:end w:w="55" w:type="dxa"/>
+            </w:tcMar>
+          </w:tcPr>
+          <w:p>
+            <w:pPr>
+              <w:spacing w:before="0" w:after="0" w:line="240" w:lineRule="auto"/>
+              <w:jc w:val="left"/>
+            </w:pPr>
+            <w:r>
+              <w:rPr>
+                <w:rFonts w:ascii="Arial" w:hAnsi="Arial"/>
+                <w:b w:val="0"/>
+                <w:color w:val="000000"/>
+                <w:sz w:val="19"/>
+              </w:rPr>
+              <w:t>A best market, investment return, or optimal site.</w:t>
+            </w:r>
+          </w:p>
+        </w:tc>
+      </w:tr>
+    </w:tbl>
     <w:p>
       <w:pPr>
-        <w:pStyle w:val="ListBullet"/>
-        <w:spacing w:after="24"/>
-        <w:ind w:left="230" w:hanging="173"/>
+        <w:spacing w:after="0" w:line="60" w:lineRule="auto"/>
       </w:pPr>
-      <w:r>
-        <w:t>The 15-country set covers major energy consumers but does not represent every market or region.</w:t>
-      </w:r>
-    </w:p>
-    <w:p>
-      <w:pPr>
-        <w:pStyle w:val="ListBullet"/>
-        <w:spacing w:after="24"/>
-        <w:ind w:left="230" w:hanging="173"/>
-      </w:pPr>
-      <w:r>
-        <w:t>Reference years differ, so the views do not describe one common period and cannot support causal claims.</w:t>
-      </w:r>
-    </w:p>
-    <w:p>
-      <w:pPr>
-        <w:pStyle w:val="ListBullet"/>
-        <w:spacing w:after="24"/>
-        <w:ind w:left="230" w:hanging="173"/>
-      </w:pPr>
-      <w:r>
-        <w:t>USD price comparisons inherit exchange-rate uncertainty; the source does not specify the conversion date.</w:t>
-      </w:r>
-    </w:p>
-    <w:p>
-      <w:pPr>
-        <w:pStyle w:val="ListBullet"/>
-        <w:spacing w:after="24"/>
-        <w:ind w:left="230" w:hanging="173"/>
-      </w:pPr>
-      <w:r>
-        <w:t>National consumption is absolute rather than per capita. It says nothing about a specific facility load or sector.</w:t>
-      </w:r>
-    </w:p>
-    <w:p>
-      <w:pPr>
-        <w:pStyle w:val="ListBullet"/>
-        <w:spacing w:after="24"/>
-        <w:ind w:left="230" w:hanging="173"/>
-      </w:pPr>
-      <w:r>
-        <w:t>The residual other generation category includes nuclear and other renewables. It is not one technology.</w:t>
-      </w:r>
-    </w:p>
-    <w:p>
-      <w:pPr>
-        <w:pStyle w:val="ListBullet"/>
-        <w:spacing w:after="24"/>
-        <w:ind w:left="230" w:hanging="173"/>
-      </w:pPr>
-      <w:r>
-        <w:t>Imports, exports, and domestic production do not directly measure price stability, grid reliability, or geopolitical risk.</w:t>
-      </w:r>
     </w:p>
     <w:p>
       <w:pPr>
         <w:pStyle w:val="Heading1"/>
       </w:pPr>
       <w:r>
-        <w:t>Decision use and reflection</w:t>
+        <w:t>Limits and decision use</w:t>
       </w:r>
     </w:p>
     <w:p>
       <w:r>
-        <w:t>The cross-sectional data can identify countries that combine a reported price, a less fossil-intensive electricity mix, and a chosen trade position. It can also expose tradeoffs that warrant local diligence. The data cannot prove that generation sources cause retail prices, predict future tariffs, rank locations on one defensible score, or establish that a net importer faces unreliable supply. Teams should confirm industrial tariffs, demand charges, time-of-use rules, renewable procurement options, and continuity requirements for each shortlisted facility.</w:t>
+        <w:t>The market scope is non-random. Missing values, mixed reference years, flagged fallbacks, national averages, and source-definition differences limit comparison. Correlations use complete cases and have no confidence intervals. The Expanded 50 balance gap is not an observed trade flow. Use the shortlist to plan diligence, not to approve an investment. A site decision needs current industrial tariffs, capital cost, contracts, connection capacity, reliability records, regulatory constraints, and an explicit objective and weighting.</w:t>
       </w:r>
     </w:p>
     <w:sectPr>
       <w:footerReference w:type="default" r:id="rId9"/>
       <w:pgSz w:w="12240" w:h="15840"/>
-      <w:pgMar w:top="691" w:right="835" w:bottom="662" w:left="835" w:header="720" w:footer="720" w:gutter="0"/>
+      <w:pgMar w:top="547" w:right="691" w:bottom="605" w:left="691" w:header="720" w:footer="720" w:gutter="0"/>
       <w:cols w:space="720"/>
       <w:docGrid w:linePitch="360"/>
     </w:sectPr>
@@ -714,16 +1678,17 @@
   <w:p>
     <w:pPr>
       <w:pStyle w:val="Footer"/>
-      <w:jc w:val="left"/>
+      <w:spacing w:before="0" w:after="0"/>
+      <w:jc w:val="center"/>
     </w:pPr>
     <w:r>
       <w:rPr>
         <w:rFonts w:ascii="Arial" w:hAnsi="Arial"/>
-        <w:b/>
-        <w:color w:val="62675F"/>
-        <w:sz w:val="13"/>
-      </w:rPr>
-      <w:t>GLOBAL ENERGY DECISION ATLAS   •   SUPPLIED CSV: 15 ROWS × 49 COLUMNS   •   STATIC LOCAL ANALYSIS</w:t>
+        <w:b w:val="0"/>
+        <w:color w:val="4F5B54"/>
+        <w:sz w:val="17"/>
+      </w:rPr>
+      <w:t>© 2026 Zhekai Li</w:t>
     </w:r>
   </w:p>
 </w:ftr>
@@ -1093,12 +2058,12 @@
     <w:qFormat/>
     <w:rsid w:val="00FC693F"/>
     <w:pPr>
-      <w:spacing w:after="70" w:line="247" w:lineRule="auto"/>
+      <w:spacing w:after="44" w:line="240" w:lineRule="auto"/>
     </w:pPr>
     <w:rPr>
       <w:rFonts w:ascii="Arial" w:hAnsi="Arial"/>
-      <w:color w:val="20251F"/>
-      <w:sz w:val="16"/>
+      <w:color w:val="000000"/>
+      <w:sz w:val="19"/>
     </w:rPr>
   </w:style>
   <w:style w:type="paragraph" w:styleId="Header">
@@ -1156,7 +2121,7 @@
     <w:pPr>
       <w:keepNext/>
       <w:keepLines/>
-      <w:spacing w:before="100" w:after="50"/>
+      <w:spacing w:before="80" w:after="40"/>
       <w:outlineLvl w:val="0"/>
     </w:pPr>
     <w:rPr>
@@ -1164,7 +2129,7 @@
       <w:b/>
       <w:bCs/>
       <w:color w:val="000000"/>
-      <w:sz w:val="23"/>
+      <w:sz w:val="21"/>
       <w:szCs w:val="28"/>
     </w:rPr>
   </w:style>
@@ -1180,15 +2145,15 @@
     <w:pPr>
       <w:keepNext/>
       <w:keepLines/>
-      <w:spacing w:before="100" w:after="50"/>
+      <w:spacing w:before="200" w:after="0"/>
       <w:outlineLvl w:val="1"/>
     </w:pPr>
     <w:rPr>
-      <w:rFonts w:asciiTheme="majorHAnsi" w:eastAsiaTheme="majorEastAsia" w:hAnsiTheme="majorHAnsi" w:cstheme="majorBidi" w:ascii="Arial" w:hAnsi="Arial"/>
+      <w:rFonts w:asciiTheme="majorHAnsi" w:eastAsiaTheme="majorEastAsia" w:hAnsiTheme="majorHAnsi" w:cstheme="majorBidi"/>
       <w:b/>
       <w:bCs/>
-      <w:color w:val="000000"/>
-      <w:sz w:val="19"/>
+      <w:color w:val="4F81BD" w:themeColor="accent1"/>
+      <w:sz w:val="26"/>
       <w:szCs w:val="26"/>
     </w:rPr>
   </w:style>
@@ -1442,10 +2407,7 @@
     <w:qFormat/>
     <w:rsid w:val="00FC693F"/>
     <w:pPr>
-      <w:pBdr>
-        <w:bottom w:val="single" w:sz="8" w:space="4" w:color="4F81BD" w:themeColor="accent1"/>
-      </w:pBdr>
-      <w:spacing w:after="80" w:line="240" w:lineRule="auto"/>
+      <w:spacing w:after="40" w:line="240" w:lineRule="auto"/>
       <w:contextualSpacing/>
     </w:pPr>
     <w:rPr>
@@ -1454,7 +2416,7 @@
       <w:color w:val="000000"/>
       <w:spacing w:val="5"/>
       <w:kern w:val="28"/>
-      <w:sz w:val="44"/>
+      <w:sz w:val="40"/>
       <w:szCs w:val="52"/>
     </w:rPr>
   </w:style>

</xml_diff>